<commit_message>
plot and table article
</commit_message>
<xml_diff>
--- a/article/results/table2.docx
+++ b/article/results/table2.docx
@@ -83,7 +83,7 @@
                 <w:color w:val="040001"/>
                 <w:b w:val="true"/>
               </w:rPr>
-              <w:t xml:space="default">CDM name</w:t>
+              <w:t xml:space="default">Data source</w:t>
             </w:r>
           </w:p>
         </w:tc>
@@ -160,7 +160,7 @@
                 <w:sz w:val="11"/>
                 <w:color w:val="040001"/>
               </w:rPr>
-              <w:t xml:space="default">CPRD GOLD</w:t>
+              <w:t xml:space="default">CPRD Gold</w:t>
             </w:r>
           </w:p>
         </w:tc>
@@ -275,7 +275,7 @@
                 <w:rFonts w:ascii="Calibri" w:hAnsi="Calibri"/>
                 <w:sz w:val="20"/>
               </w:rPr>
-              <w:t xml:space="default">85,857 (100.00%)</w:t>
+              <w:t xml:space="default">15,138,910 (85.78%)</w:t>
             </w:r>
           </w:p>
         </w:tc>
@@ -355,7 +355,7 @@
                 <w:rFonts w:ascii="Calibri" w:hAnsi="Calibri"/>
                 <w:sz w:val="20"/>
               </w:rPr>
-              <w:t xml:space="default">32 [9 - 112]</w:t>
+              <w:t xml:space="default">33 [9 - 116]</w:t>
             </w:r>
           </w:p>
         </w:tc>
@@ -435,7 +435,7 @@
                 <w:rFonts w:ascii="Calibri" w:hAnsi="Calibri"/>
                 <w:sz w:val="20"/>
               </w:rPr>
-              <w:t xml:space="default">[1 to 14,957]</w:t>
+              <w:t xml:space="default">[1 to 78,113]</w:t>
             </w:r>
           </w:p>
         </w:tc>
@@ -515,7 +515,7 @@
                 <w:rFonts w:ascii="Calibri" w:hAnsi="Calibri"/>
                 <w:sz w:val="20"/>
               </w:rPr>
-              <w:t xml:space="default">12,499,160</w:t>
+              <w:t xml:space="default">2,257,743,423</w:t>
             </w:r>
           </w:p>
         </w:tc>
@@ -545,32 +545,32 @@
                 <w:rFonts w:ascii="Calibri" w:hAnsi="Calibri"/>
                 <w:sz w:val="20"/>
               </w:rPr>
-              <w:t xml:space="default">Duration of records</w:t>
-            </w:r>
-          </w:p>
-        </w:tc>
-        <w:tc>
-          <w:tcPr>
-            <w:tcBorders>
-              <w:top w:val="single" w:space="0" w:color="D3D3D3"/>
-              <w:bottom w:val="single" w:space="0" w:color="D3D3D3"/>
-              <w:start w:val="single" w:space="0" w:color="D3D3D3"/>
-              <w:end w:val="single" w:space="0" w:color="D3D3D3"/>
-            </w:tcBorders>
-            <w:shd w:val="clear" w:color="auto" w:fill="FFFFFF"/>
-          </w:tcPr>
-          <w:p>
-            <w:pPr>
-              <w:spacing w:before="0" w:after="60"/>
-              <w:keepNext/>
-              <w:jc w:val="start"/>
-            </w:pPr>
-            <w:r>
-              <w:rPr>
-                <w:rFonts w:ascii="Calibri" w:hAnsi="Calibri"/>
-                <w:sz w:val="20"/>
-              </w:rPr>
-              <w:t xml:space="default">Median [Q25 - Q75]</w:t>
+              <w:t xml:space="default">In observation</w:t>
+            </w:r>
+          </w:p>
+        </w:tc>
+        <w:tc>
+          <w:tcPr>
+            <w:tcBorders>
+              <w:top w:val="single" w:space="0" w:color="D3D3D3"/>
+              <w:bottom w:val="single" w:space="0" w:color="D3D3D3"/>
+              <w:start w:val="single" w:space="0" w:color="D3D3D3"/>
+              <w:end w:val="single" w:space="0" w:color="D3D3D3"/>
+            </w:tcBorders>
+            <w:shd w:val="clear" w:color="auto" w:fill="FFFFFF"/>
+          </w:tcPr>
+          <w:p>
+            <w:pPr>
+              <w:spacing w:before="0" w:after="60"/>
+              <w:keepNext/>
+              <w:jc w:val="start"/>
+            </w:pPr>
+            <w:r>
+              <w:rPr>
+                <w:rFonts w:ascii="Calibri" w:hAnsi="Calibri"/>
+                <w:sz w:val="20"/>
+              </w:rPr>
+              <w:t xml:space="default">N (%)</w:t>
             </w:r>
           </w:p>
         </w:tc>
@@ -595,7 +595,7 @@
                 <w:rFonts w:ascii="Calibri" w:hAnsi="Calibri"/>
                 <w:sz w:val="20"/>
               </w:rPr>
-              <w:t xml:space="default">27.00 [27.00 - 29.00]</w:t>
+              <w:t xml:space="default">2,234,507,406 (98.97%)</w:t>
             </w:r>
           </w:p>
         </w:tc>
@@ -607,75 +607,30 @@
         <w:tc>
           <w:tcPr>
             <w:tcBorders>
-              <w:top w:val="single" w:space="0" w:color="D3D3D3"/>
-              <w:bottom w:val="single" w:space="0" w:color="D3D3D3"/>
-              <w:start w:val="single" w:space="0" w:color="D3D3D3"/>
-              <w:end w:val="single" w:space="0" w:color="D3D3D3"/>
-            </w:tcBorders>
-            <w:shd w:val="clear" w:color="auto" w:fill="FFFFFF"/>
-          </w:tcPr>
-          <w:p>
-            <w:pPr>
-              <w:spacing w:before="0" w:after="60"/>
-              <w:keepNext/>
-              <w:jc w:val="start"/>
-            </w:pPr>
-            <w:r>
-              <w:rPr>
-                <w:rFonts w:ascii="Calibri" w:hAnsi="Calibri"/>
-                <w:sz w:val="20"/>
-              </w:rPr>
-              <w:t xml:space="default"/>
-            </w:r>
-          </w:p>
-        </w:tc>
-        <w:tc>
-          <w:tcPr>
-            <w:tcBorders>
-              <w:top w:val="single" w:space="0" w:color="D3D3D3"/>
-              <w:bottom w:val="single" w:space="0" w:color="D3D3D3"/>
-              <w:start w:val="single" w:space="0" w:color="D3D3D3"/>
-              <w:end w:val="single" w:space="0" w:color="D3D3D3"/>
-            </w:tcBorders>
-            <w:shd w:val="clear" w:color="auto" w:fill="FFFFFF"/>
-          </w:tcPr>
-          <w:p>
-            <w:pPr>
-              <w:spacing w:before="0" w:after="60"/>
-              <w:keepNext/>
-              <w:jc w:val="start"/>
-            </w:pPr>
-            <w:r>
-              <w:rPr>
-                <w:rFonts w:ascii="Calibri" w:hAnsi="Calibri"/>
-                <w:sz w:val="20"/>
-              </w:rPr>
-              <w:t xml:space="default">Range [min to max]</w:t>
-            </w:r>
-          </w:p>
-        </w:tc>
-        <w:tc>
-          <w:tcPr>
-            <w:tcBorders>
-              <w:top w:val="single" w:space="0" w:color="D3D3D3"/>
-              <w:bottom w:val="single" w:space="0" w:color="D3D3D3"/>
-              <w:start w:val="single" w:space="0" w:color="D3D3D3"/>
-              <w:end w:val="single" w:space="0" w:color="D3D3D3"/>
-            </w:tcBorders>
-            <w:shd w:val="clear" w:color="auto" w:fill="FFFFFF"/>
-          </w:tcPr>
-          <w:p>
-            <w:pPr>
-              <w:spacing w:before="0" w:after="60"/>
-              <w:keepNext/>
-              <w:jc w:val="end"/>
-            </w:pPr>
-            <w:r>
-              <w:rPr>
-                <w:rFonts w:ascii="Calibri" w:hAnsi="Calibri"/>
-                <w:sz w:val="20"/>
-              </w:rPr>
-              <w:t xml:space="default">[0.00 to 364.00]</w:t>
+              <w:top w:val="single" w:sz="16" w:space="0" w:color="D3D3D3"/>
+              <w:bottom w:val="single" w:sz="16" w:space="0" w:color="D3D3D3"/>
+              <w:start w:val="single" w:space="0" w:color="D3D3D3"/>
+              <w:end w:val="single" w:space="0" w:color="D3D3D3"/>
+            </w:tcBorders>
+            <w:shd w:val="clear" w:color="auto" w:fill="F4E9EB"/>
+            <w:tcMar>
+              <w:top w:w="25" w:type="dxa"/>
+            </w:tcMar>
+            <w:gridSpan w:val="3"/>
+          </w:tcPr>
+          <w:p>
+            <w:pPr>
+              <w:spacing w:before="0" w:after="60"/>
+              <w:keepNext/>
+            </w:pPr>
+            <w:r>
+              <w:rPr>
+                <w:rFonts w:ascii="Calibri" w:hAnsi="Calibri"/>
+                <w:sz w:val="20"/>
+                <w:color w:val="040001"/>
+                <w:b w:val="true"/>
+              </w:rPr>
+              <w:t xml:space="default">Domain</w:t>
             </w:r>
           </w:p>
         </w:tc>
@@ -705,7 +660,7 @@
                 <w:rFonts w:ascii="Calibri" w:hAnsi="Calibri"/>
                 <w:sz w:val="20"/>
               </w:rPr>
-              <w:t xml:space="default">In observation</w:t>
+              <w:t xml:space="default">Drug</w:t>
             </w:r>
           </w:p>
         </w:tc>
@@ -755,7 +710,7 @@
                 <w:rFonts w:ascii="Calibri" w:hAnsi="Calibri"/>
                 <w:sz w:val="20"/>
               </w:rPr>
-              <w:t xml:space="default">12,371,796 (98.98%)</w:t>
+              <w:t xml:space="default">2,257,736,064 (100.00%)</w:t>
             </w:r>
           </w:p>
         </w:tc>
@@ -767,6 +722,86 @@
         <w:tc>
           <w:tcPr>
             <w:tcBorders>
+              <w:top w:val="single" w:space="0" w:color="D3D3D3"/>
+              <w:bottom w:val="single" w:space="0" w:color="D3D3D3"/>
+              <w:start w:val="single" w:space="0" w:color="D3D3D3"/>
+              <w:end w:val="single" w:space="0" w:color="D3D3D3"/>
+            </w:tcBorders>
+            <w:shd w:val="clear" w:color="auto" w:fill="FFFFFF"/>
+          </w:tcPr>
+          <w:p>
+            <w:pPr>
+              <w:spacing w:before="0" w:after="60"/>
+              <w:keepNext/>
+              <w:jc w:val="start"/>
+            </w:pPr>
+            <w:r>
+              <w:rPr>
+                <w:rFonts w:ascii="Calibri" w:hAnsi="Calibri"/>
+                <w:sz w:val="20"/>
+              </w:rPr>
+              <w:t xml:space="default">Metadata</w:t>
+            </w:r>
+          </w:p>
+        </w:tc>
+        <w:tc>
+          <w:tcPr>
+            <w:tcBorders>
+              <w:top w:val="single" w:space="0" w:color="D3D3D3"/>
+              <w:bottom w:val="single" w:space="0" w:color="D3D3D3"/>
+              <w:start w:val="single" w:space="0" w:color="D3D3D3"/>
+              <w:end w:val="single" w:space="0" w:color="D3D3D3"/>
+            </w:tcBorders>
+            <w:shd w:val="clear" w:color="auto" w:fill="FFFFFF"/>
+          </w:tcPr>
+          <w:p>
+            <w:pPr>
+              <w:spacing w:before="0" w:after="60"/>
+              <w:keepNext/>
+              <w:jc w:val="start"/>
+            </w:pPr>
+            <w:r>
+              <w:rPr>
+                <w:rFonts w:ascii="Calibri" w:hAnsi="Calibri"/>
+                <w:sz w:val="20"/>
+              </w:rPr>
+              <w:t xml:space="default">N (%)</w:t>
+            </w:r>
+          </w:p>
+        </w:tc>
+        <w:tc>
+          <w:tcPr>
+            <w:tcBorders>
+              <w:top w:val="single" w:space="0" w:color="D3D3D3"/>
+              <w:bottom w:val="single" w:space="0" w:color="D3D3D3"/>
+              <w:start w:val="single" w:space="0" w:color="D3D3D3"/>
+              <w:end w:val="single" w:space="0" w:color="D3D3D3"/>
+            </w:tcBorders>
+            <w:shd w:val="clear" w:color="auto" w:fill="FFFFFF"/>
+          </w:tcPr>
+          <w:p>
+            <w:pPr>
+              <w:spacing w:before="0" w:after="60"/>
+              <w:keepNext/>
+              <w:jc w:val="end"/>
+            </w:pPr>
+            <w:r>
+              <w:rPr>
+                <w:rFonts w:ascii="Calibri" w:hAnsi="Calibri"/>
+                <w:sz w:val="20"/>
+              </w:rPr>
+              <w:t xml:space="default">7,359 (0.00%)</w:t>
+            </w:r>
+          </w:p>
+        </w:tc>
+      </w:tr>
+      <w:tr>
+        <w:trPr>
+          <w:cantSplit/>
+        </w:trPr>
+        <w:tc>
+          <w:tcPr>
+            <w:tcBorders>
               <w:top w:val="single" w:sz="16" w:space="0" w:color="D3D3D3"/>
               <w:bottom w:val="single" w:sz="16" w:space="0" w:color="D3D3D3"/>
               <w:start w:val="single" w:space="0" w:color="D3D3D3"/>
@@ -790,7 +825,7 @@
                 <w:color w:val="040001"/>
                 <w:b w:val="true"/>
               </w:rPr>
-              <w:t xml:space="default">Domain</w:t>
+              <w:t xml:space="default">Standard concept</w:t>
             </w:r>
           </w:p>
         </w:tc>
@@ -820,7 +855,7 @@
                 <w:rFonts w:ascii="Calibri" w:hAnsi="Calibri"/>
                 <w:sz w:val="20"/>
               </w:rPr>
-              <w:t xml:space="default">Drug</w:t>
+              <w:t xml:space="default">No matching concept</w:t>
             </w:r>
           </w:p>
         </w:tc>
@@ -870,7 +905,7 @@
                 <w:rFonts w:ascii="Calibri" w:hAnsi="Calibri"/>
                 <w:sz w:val="20"/>
               </w:rPr>
-              <w:t xml:space="default">12,499,126 (100.00%)</w:t>
+              <w:t xml:space="default">7,359 (0.00%)</w:t>
             </w:r>
           </w:p>
         </w:tc>
@@ -900,7 +935,7 @@
                 <w:rFonts w:ascii="Calibri" w:hAnsi="Calibri"/>
                 <w:sz w:val="20"/>
               </w:rPr>
-              <w:t xml:space="default">Metadata</w:t>
+              <w:t xml:space="default">Standard</w:t>
             </w:r>
           </w:p>
         </w:tc>
@@ -950,7 +985,7 @@
                 <w:rFonts w:ascii="Calibri" w:hAnsi="Calibri"/>
                 <w:sz w:val="20"/>
               </w:rPr>
-              <w:t xml:space="default">34 (0.00%)</w:t>
+              <w:t xml:space="default">2,257,736,064 (100.00%)</w:t>
             </w:r>
           </w:p>
         </w:tc>
@@ -985,7 +1020,7 @@
                 <w:color w:val="040001"/>
                 <w:b w:val="true"/>
               </w:rPr>
-              <w:t xml:space="default">Standard concept</w:t>
+              <w:t xml:space="default">Standard vocabulary</w:t>
             </w:r>
           </w:p>
         </w:tc>
@@ -1015,7 +1050,7 @@
                 <w:rFonts w:ascii="Calibri" w:hAnsi="Calibri"/>
                 <w:sz w:val="20"/>
               </w:rPr>
-              <w:t xml:space="default">No matching concept</w:t>
+              <w:t xml:space="default">CVX</w:t>
             </w:r>
           </w:p>
         </w:tc>
@@ -1065,7 +1100,7 @@
                 <w:rFonts w:ascii="Calibri" w:hAnsi="Calibri"/>
                 <w:sz w:val="20"/>
               </w:rPr>
-              <w:t xml:space="default">34 (0.00%)</w:t>
+              <w:t xml:space="default">82,065,686 (3.63%)</w:t>
             </w:r>
           </w:p>
         </w:tc>
@@ -1095,7 +1130,7 @@
                 <w:rFonts w:ascii="Calibri" w:hAnsi="Calibri"/>
                 <w:sz w:val="20"/>
               </w:rPr>
-              <w:t xml:space="default">Standard</w:t>
+              <w:t xml:space="default">None</w:t>
             </w:r>
           </w:p>
         </w:tc>
@@ -1145,7 +1180,7 @@
                 <w:rFonts w:ascii="Calibri" w:hAnsi="Calibri"/>
                 <w:sz w:val="20"/>
               </w:rPr>
-              <w:t xml:space="default">12,499,126 (100.00%)</w:t>
+              <w:t xml:space="default">7,359 (0.00%)</w:t>
             </w:r>
           </w:p>
         </w:tc>
@@ -1157,6 +1192,166 @@
         <w:tc>
           <w:tcPr>
             <w:tcBorders>
+              <w:top w:val="single" w:space="0" w:color="D3D3D3"/>
+              <w:bottom w:val="single" w:space="0" w:color="D3D3D3"/>
+              <w:start w:val="single" w:space="0" w:color="D3D3D3"/>
+              <w:end w:val="single" w:space="0" w:color="D3D3D3"/>
+            </w:tcBorders>
+            <w:shd w:val="clear" w:color="auto" w:fill="FFFFFF"/>
+          </w:tcPr>
+          <w:p>
+            <w:pPr>
+              <w:spacing w:before="0" w:after="60"/>
+              <w:keepNext/>
+              <w:jc w:val="start"/>
+            </w:pPr>
+            <w:r>
+              <w:rPr>
+                <w:rFonts w:ascii="Calibri" w:hAnsi="Calibri"/>
+                <w:sz w:val="20"/>
+              </w:rPr>
+              <w:t xml:space="default">RxNorm</w:t>
+            </w:r>
+          </w:p>
+        </w:tc>
+        <w:tc>
+          <w:tcPr>
+            <w:tcBorders>
+              <w:top w:val="single" w:space="0" w:color="D3D3D3"/>
+              <w:bottom w:val="single" w:space="0" w:color="D3D3D3"/>
+              <w:start w:val="single" w:space="0" w:color="D3D3D3"/>
+              <w:end w:val="single" w:space="0" w:color="D3D3D3"/>
+            </w:tcBorders>
+            <w:shd w:val="clear" w:color="auto" w:fill="FFFFFF"/>
+          </w:tcPr>
+          <w:p>
+            <w:pPr>
+              <w:spacing w:before="0" w:after="60"/>
+              <w:keepNext/>
+              <w:jc w:val="start"/>
+            </w:pPr>
+            <w:r>
+              <w:rPr>
+                <w:rFonts w:ascii="Calibri" w:hAnsi="Calibri"/>
+                <w:sz w:val="20"/>
+              </w:rPr>
+              <w:t xml:space="default">N (%)</w:t>
+            </w:r>
+          </w:p>
+        </w:tc>
+        <w:tc>
+          <w:tcPr>
+            <w:tcBorders>
+              <w:top w:val="single" w:space="0" w:color="D3D3D3"/>
+              <w:bottom w:val="single" w:space="0" w:color="D3D3D3"/>
+              <w:start w:val="single" w:space="0" w:color="D3D3D3"/>
+              <w:end w:val="single" w:space="0" w:color="D3D3D3"/>
+            </w:tcBorders>
+            <w:shd w:val="clear" w:color="auto" w:fill="FFFFFF"/>
+          </w:tcPr>
+          <w:p>
+            <w:pPr>
+              <w:spacing w:before="0" w:after="60"/>
+              <w:keepNext/>
+              <w:jc w:val="end"/>
+            </w:pPr>
+            <w:r>
+              <w:rPr>
+                <w:rFonts w:ascii="Calibri" w:hAnsi="Calibri"/>
+                <w:sz w:val="20"/>
+              </w:rPr>
+              <w:t xml:space="default">1,641,448,400 (72.70%)</w:t>
+            </w:r>
+          </w:p>
+        </w:tc>
+      </w:tr>
+      <w:tr>
+        <w:trPr>
+          <w:cantSplit/>
+        </w:trPr>
+        <w:tc>
+          <w:tcPr>
+            <w:tcBorders>
+              <w:top w:val="single" w:space="0" w:color="D3D3D3"/>
+              <w:bottom w:val="single" w:space="0" w:color="D3D3D3"/>
+              <w:start w:val="single" w:space="0" w:color="D3D3D3"/>
+              <w:end w:val="single" w:space="0" w:color="D3D3D3"/>
+            </w:tcBorders>
+            <w:shd w:val="clear" w:color="auto" w:fill="FFFFFF"/>
+          </w:tcPr>
+          <w:p>
+            <w:pPr>
+              <w:spacing w:before="0" w:after="60"/>
+              <w:keepNext/>
+              <w:jc w:val="start"/>
+            </w:pPr>
+            <w:r>
+              <w:rPr>
+                <w:rFonts w:ascii="Calibri" w:hAnsi="Calibri"/>
+                <w:sz w:val="20"/>
+              </w:rPr>
+              <w:t xml:space="default">RxNorm Extension</w:t>
+            </w:r>
+          </w:p>
+        </w:tc>
+        <w:tc>
+          <w:tcPr>
+            <w:tcBorders>
+              <w:top w:val="single" w:space="0" w:color="D3D3D3"/>
+              <w:bottom w:val="single" w:space="0" w:color="D3D3D3"/>
+              <w:start w:val="single" w:space="0" w:color="D3D3D3"/>
+              <w:end w:val="single" w:space="0" w:color="D3D3D3"/>
+            </w:tcBorders>
+            <w:shd w:val="clear" w:color="auto" w:fill="FFFFFF"/>
+          </w:tcPr>
+          <w:p>
+            <w:pPr>
+              <w:spacing w:before="0" w:after="60"/>
+              <w:keepNext/>
+              <w:jc w:val="start"/>
+            </w:pPr>
+            <w:r>
+              <w:rPr>
+                <w:rFonts w:ascii="Calibri" w:hAnsi="Calibri"/>
+                <w:sz w:val="20"/>
+              </w:rPr>
+              <w:t xml:space="default">N (%)</w:t>
+            </w:r>
+          </w:p>
+        </w:tc>
+        <w:tc>
+          <w:tcPr>
+            <w:tcBorders>
+              <w:top w:val="single" w:space="0" w:color="D3D3D3"/>
+              <w:bottom w:val="single" w:space="0" w:color="D3D3D3"/>
+              <w:start w:val="single" w:space="0" w:color="D3D3D3"/>
+              <w:end w:val="single" w:space="0" w:color="D3D3D3"/>
+            </w:tcBorders>
+            <w:shd w:val="clear" w:color="auto" w:fill="FFFFFF"/>
+          </w:tcPr>
+          <w:p>
+            <w:pPr>
+              <w:spacing w:before="0" w:after="60"/>
+              <w:keepNext/>
+              <w:jc w:val="end"/>
+            </w:pPr>
+            <w:r>
+              <w:rPr>
+                <w:rFonts w:ascii="Calibri" w:hAnsi="Calibri"/>
+                <w:sz w:val="20"/>
+              </w:rPr>
+              <w:t xml:space="default">534,221,978 (23.66%)</w:t>
+            </w:r>
+          </w:p>
+        </w:tc>
+      </w:tr>
+      <w:tr>
+        <w:trPr>
+          <w:cantSplit/>
+        </w:trPr>
+        <w:tc>
+          <w:tcPr>
+            <w:tcBorders>
               <w:top w:val="single" w:sz="16" w:space="0" w:color="D3D3D3"/>
               <w:bottom w:val="single" w:sz="16" w:space="0" w:color="D3D3D3"/>
               <w:start w:val="single" w:space="0" w:color="D3D3D3"/>
@@ -1210,7 +1405,7 @@
                 <w:rFonts w:ascii="Calibri" w:hAnsi="Calibri"/>
                 <w:sz w:val="20"/>
               </w:rPr>
-              <w:t xml:space="default">Gemscript</w:t>
+              <w:t xml:space="default">dm+d</w:t>
             </w:r>
           </w:p>
         </w:tc>
@@ -1260,7 +1455,7 @@
                 <w:rFonts w:ascii="Calibri" w:hAnsi="Calibri"/>
                 <w:sz w:val="20"/>
               </w:rPr>
-              <w:t xml:space="default">11,973,690 (95.80%)</w:t>
+              <w:t xml:space="default">1,765,093 (0.08%)</w:t>
             </w:r>
           </w:p>
         </w:tc>
@@ -1290,7 +1485,7 @@
                 <w:rFonts w:ascii="Calibri" w:hAnsi="Calibri"/>
                 <w:sz w:val="20"/>
               </w:rPr>
-              <w:t xml:space="default">None</w:t>
+              <w:t xml:space="default">Gemscript</w:t>
             </w:r>
           </w:p>
         </w:tc>
@@ -1340,7 +1535,7 @@
                 <w:rFonts w:ascii="Calibri" w:hAnsi="Calibri"/>
                 <w:sz w:val="20"/>
               </w:rPr>
-              <w:t xml:space="default">456 (0.00%)</w:t>
+              <w:t xml:space="default">2,145,261,385 (95.02%)</w:t>
             </w:r>
           </w:p>
         </w:tc>
@@ -1420,7 +1615,7 @@
                 <w:rFonts w:ascii="Calibri" w:hAnsi="Calibri"/>
                 <w:sz w:val="20"/>
               </w:rPr>
-              <w:t xml:space="default">525,014 (4.20%)</w:t>
+              <w:t xml:space="default">110,716,945 (4.90%)</w:t>
             </w:r>
           </w:p>
         </w:tc>
@@ -1455,7 +1650,7 @@
                 <w:color w:val="040001"/>
                 <w:b w:val="true"/>
               </w:rPr>
-              <w:t xml:space="default">Type concept id</w:t>
+              <w:t xml:space="default">Type concept</w:t>
             </w:r>
           </w:p>
         </w:tc>
@@ -1535,7 +1730,7 @@
                 <w:rFonts w:ascii="Calibri" w:hAnsi="Calibri"/>
                 <w:sz w:val="20"/>
               </w:rPr>
-              <w:t xml:space="default">534,016 (4.27%)</w:t>
+              <w:t xml:space="default">112,175,525 (4.97%)</w:t>
             </w:r>
           </w:p>
         </w:tc>
@@ -1615,7 +1810,7 @@
                 <w:rFonts w:ascii="Calibri" w:hAnsi="Calibri"/>
                 <w:sz w:val="20"/>
               </w:rPr>
-              <w:t xml:space="default">11,965,144 (95.73%)</w:t>
+              <w:t xml:space="default">2,145,567,898 (95.03%)</w:t>
             </w:r>
           </w:p>
         </w:tc>
@@ -1730,7 +1925,7 @@
                 <w:rFonts w:ascii="Calibri" w:hAnsi="Calibri"/>
                 <w:sz w:val="20"/>
               </w:rPr>
-              <w:t xml:space="default">9,609,270 (76.88%)</w:t>
+              <w:t xml:space="default">1,725,606,814 (76.43%)</w:t>
             </w:r>
           </w:p>
         </w:tc>
@@ -1810,7 +2005,7 @@
                 <w:rFonts w:ascii="Calibri" w:hAnsi="Calibri"/>
                 <w:sz w:val="20"/>
               </w:rPr>
-              <w:t xml:space="default">150,382 (1.20%)</w:t>
+              <w:t xml:space="default">26,769,962 (1.19%)</w:t>
             </w:r>
           </w:p>
         </w:tc>
@@ -1890,7 +2085,7 @@
                 <w:rFonts w:ascii="Calibri" w:hAnsi="Calibri"/>
                 <w:sz w:val="20"/>
               </w:rPr>
-              <w:t xml:space="default">201,686 (1.61%)</w:t>
+              <w:t xml:space="default">36,058,698 (1.60%)</w:t>
             </w:r>
           </w:p>
         </w:tc>
@@ -1970,7 +2165,7 @@
                 <w:rFonts w:ascii="Calibri" w:hAnsi="Calibri"/>
                 <w:sz w:val="20"/>
               </w:rPr>
-              <w:t xml:space="default">2,024,485 (16.20%)</w:t>
+              <w:t xml:space="default">359,604,256 (15.93%)</w:t>
             </w:r>
           </w:p>
         </w:tc>
@@ -2050,7 +2245,7 @@
                 <w:rFonts w:ascii="Calibri" w:hAnsi="Calibri"/>
                 <w:sz w:val="20"/>
               </w:rPr>
-              <w:t xml:space="default">212,650 (1.70%)</w:t>
+              <w:t xml:space="default">55,295,724 (2.45%)</w:t>
             </w:r>
           </w:p>
         </w:tc>

</xml_diff>